<commit_message>
power in moral realsm
</commit_message>
<xml_diff>
--- a/Basics/PL - Power znana jako sprawczość.docx
+++ b/Basics/PL - Power znana jako sprawczość.docx
@@ -13,15 +13,7 @@
         <w:t xml:space="preserve"> i </w:t>
       </w:r>
       <w:r>
-        <w:t xml:space="preserve"> tłumaczyć ‘</w:t>
-      </w:r>
-      <w:proofErr w:type="spellStart"/>
-      <w:r>
-        <w:t>power</w:t>
-      </w:r>
-      <w:proofErr w:type="spellEnd"/>
-      <w:r>
-        <w:t>’ na język polski.</w:t>
+        <w:t xml:space="preserve"> tłumaczyć ‘power’ na język polski.</w:t>
       </w:r>
     </w:p>
     <w:p>
@@ -50,103 +42,23 @@
         <w:jc w:val="both"/>
       </w:pPr>
       <w:r>
-        <w:t xml:space="preserve">Tłumaczenie to oddaje </w:t>
-      </w:r>
-      <w:proofErr w:type="spellStart"/>
-      <w:r>
-        <w:t>kwintensencj</w:t>
-      </w:r>
-      <w:proofErr w:type="spellEnd"/>
-      <w:r>
-        <w:t xml:space="preserve"> znaczenia </w:t>
-      </w:r>
-      <w:proofErr w:type="spellStart"/>
-      <w:r>
-        <w:t>power</w:t>
-      </w:r>
-      <w:proofErr w:type="spellEnd"/>
-      <w:r>
-        <w:t xml:space="preserve"> w kontekście stosunków międzynarodowych. Power nie jest potencjałem, liczbą w </w:t>
-      </w:r>
-      <w:proofErr w:type="spellStart"/>
-      <w:r>
-        <w:t>excelu</w:t>
-      </w:r>
-      <w:proofErr w:type="spellEnd"/>
-      <w:r>
-        <w:t>, jest akcją, występującą pomiędzy co najmniej dwoma aktorami. Nie ważne czy mówmy o przymuszeniu (</w:t>
-      </w:r>
-      <w:proofErr w:type="spellStart"/>
-      <w:r>
-        <w:t>coercion</w:t>
-      </w:r>
-      <w:proofErr w:type="spellEnd"/>
-      <w:r>
-        <w:t xml:space="preserve"> – hard </w:t>
-      </w:r>
-      <w:proofErr w:type="spellStart"/>
-      <w:r>
-        <w:t>power</w:t>
-      </w:r>
-      <w:proofErr w:type="spellEnd"/>
-      <w:r>
-        <w:t>) czy też wywołanie efektu poprzez oczarowanie drugiej strony (</w:t>
-      </w:r>
-      <w:proofErr w:type="spellStart"/>
-      <w:r>
-        <w:t>charm</w:t>
-      </w:r>
-      <w:proofErr w:type="spellEnd"/>
-      <w:r>
-        <w:t xml:space="preserve"> – </w:t>
-      </w:r>
-      <w:proofErr w:type="spellStart"/>
-      <w:r>
-        <w:t>soft</w:t>
-      </w:r>
-      <w:proofErr w:type="spellEnd"/>
-      <w:r>
-        <w:t xml:space="preserve"> </w:t>
-      </w:r>
-      <w:proofErr w:type="spellStart"/>
-      <w:r>
-        <w:t>power</w:t>
-      </w:r>
-      <w:proofErr w:type="spellEnd"/>
-      <w:r>
-        <w:t>), państwo potrafiące oddziaływać na pozostałe, posiada sprawczość, właśnie.</w:t>
-      </w:r>
-    </w:p>
-    <w:p>
-      <w:pPr>
-        <w:jc w:val="both"/>
-      </w:pPr>
-      <w:r>
-        <w:t xml:space="preserve">Czy </w:t>
-      </w:r>
-      <w:proofErr w:type="spellStart"/>
-      <w:r>
-        <w:t>power</w:t>
-      </w:r>
-      <w:proofErr w:type="spellEnd"/>
-      <w:r>
-        <w:t xml:space="preserve"> to cecha aktora (państwa) czy też cecha relacji (oddziaływania)? </w:t>
-      </w:r>
-    </w:p>
-    <w:p>
-      <w:pPr>
-        <w:jc w:val="both"/>
-      </w:pPr>
-      <w:r>
-        <w:t xml:space="preserve">Jeżeli </w:t>
-      </w:r>
-      <w:proofErr w:type="spellStart"/>
-      <w:r>
-        <w:t>power</w:t>
-      </w:r>
-      <w:proofErr w:type="spellEnd"/>
-      <w:r>
-        <w:t xml:space="preserve"> byłaby rozumiana jako sprawczość, to państwa posiadają sprawczość. Aktor posiada zdolność oddziaływania na innych. Dana sprawczość może posiadać własne cechy (typ relacji, zakres, poziom natężenia zarówno relatywny jak i absolutny) natomiast sprawczość sama w sobie jest cechą państwa.</w:t>
+        <w:t>Tłumaczenie to oddaje kwintensencj znaczenia power w kontekście stosunków międzynarodowych. Power nie jest potencjałem, liczbą w excelu, jest akcją, występującą pomiędzy co najmniej dwoma aktorami. Nie ważne czy mówmy o przymuszeniu (coercion – hard power) czy też wywołanie efektu poprzez oczarowanie drugiej strony (charm – soft power), państwo potrafiące oddziaływać na pozostałe, posiada sprawczość, właśnie.</w:t>
+      </w:r>
+    </w:p>
+    <w:p>
+      <w:pPr>
+        <w:jc w:val="both"/>
+      </w:pPr>
+      <w:r>
+        <w:t xml:space="preserve">Czy power to cecha aktora (państwa) czy też cecha relacji (oddziaływania)? </w:t>
+      </w:r>
+    </w:p>
+    <w:p>
+      <w:pPr>
+        <w:jc w:val="both"/>
+      </w:pPr>
+      <w:r>
+        <w:t>Jeżeli power byłaby rozumiana jako sprawczość, to państwa posiadają sprawczość. Aktor posiada zdolność oddziaływania na innych. Dana sprawczość może posiadać własne cechy (typ relacji, zakres, poziom natężenia zarówno relatywny jak i absolutny) natomiast sprawczość sama w sobie jest cechą państwa.</w:t>
       </w:r>
     </w:p>
     <w:p>
@@ -162,39 +74,7 @@
         <w:jc w:val="both"/>
       </w:pPr>
       <w:r>
-        <w:t xml:space="preserve">Czy tak </w:t>
-      </w:r>
-      <w:proofErr w:type="spellStart"/>
-      <w:r>
-        <w:t>zinterpetowana</w:t>
-      </w:r>
-      <w:proofErr w:type="spellEnd"/>
-      <w:r>
-        <w:t xml:space="preserve"> </w:t>
-      </w:r>
-      <w:proofErr w:type="spellStart"/>
-      <w:r>
-        <w:t>power</w:t>
-      </w:r>
-      <w:proofErr w:type="spellEnd"/>
-      <w:r>
-        <w:t xml:space="preserve"> jest przydatna z analitycznego punktu widzenia? Jak porównać </w:t>
-      </w:r>
-      <w:proofErr w:type="spellStart"/>
-      <w:r>
-        <w:t>power</w:t>
-      </w:r>
-      <w:proofErr w:type="spellEnd"/>
-      <w:r>
-        <w:t xml:space="preserve"> USA i Chin jeżeli do tego </w:t>
-      </w:r>
-      <w:proofErr w:type="spellStart"/>
-      <w:r>
-        <w:t>trzebaby</w:t>
-      </w:r>
-      <w:proofErr w:type="spellEnd"/>
-      <w:r>
-        <w:t xml:space="preserve"> uwzględnić nie tylko sprawczości między nimi ale również ich zdolności do oddziaływania przeciwko (albo wraz z) pozostałym państwom.</w:t>
+        <w:t>Czy tak zinterpetowana power jest przydatna z analitycznego punktu widzenia? Jak porównać power USA i Chin jeżeli do tego trzebaby uwzględnić nie tylko sprawczości między nimi ale również ich zdolności do oddziaływania przeciwko (albo wraz z) pozostałym państwom.</w:t>
       </w:r>
     </w:p>
     <w:p>
@@ -215,22 +95,20 @@
         <w:jc w:val="both"/>
       </w:pPr>
       <w:r>
-        <w:t xml:space="preserve">Jak inni definiują albo tłumaczą </w:t>
-      </w:r>
-      <w:proofErr w:type="spellStart"/>
-      <w:r>
-        <w:t>power</w:t>
-      </w:r>
-      <w:proofErr w:type="spellEnd"/>
-      <w:r>
-        <w:t>?</w:t>
-      </w:r>
-    </w:p>
-    <w:p>
-      <w:pPr>
-        <w:jc w:val="both"/>
-      </w:pPr>
-      <w:r>
+        <w:t>Jak inni definiują albo tłumaczą power?</w:t>
+      </w:r>
+    </w:p>
+    <w:p>
+      <w:pPr>
+        <w:jc w:val="both"/>
+        <w:rPr>
+          <w:lang w:val="en-US"/>
+        </w:rPr>
+      </w:pPr>
+      <w:r>
+        <w:rPr>
+          <w:lang w:val="en-US"/>
+        </w:rPr>
         <w:t>Max Weber:</w:t>
       </w:r>
     </w:p>
@@ -248,21 +126,7 @@
         <w:rPr>
           <w:lang w:val="en-US"/>
         </w:rPr>
-        <w:t xml:space="preserve">hat one actor within a social relationship will be in a position to carryout his own will despite resistance, regardless of the basis on which the </w:t>
-      </w:r>
-      <w:proofErr w:type="spellStart"/>
-      <w:r>
-        <w:rPr>
-          <w:lang w:val="en-US"/>
-        </w:rPr>
-        <w:t>proabability</w:t>
-      </w:r>
-      <w:proofErr w:type="spellEnd"/>
-      <w:r>
-        <w:rPr>
-          <w:lang w:val="en-US"/>
-        </w:rPr>
-        <w:t xml:space="preserve"> rests.-</w:t>
+        <w:t>hat one actor within a social relationship will be in a position to carryout his own will despite resistance, regardless of the basis on which the proabability rests.-</w:t>
       </w:r>
       <w:r>
         <w:rPr>
@@ -340,110 +204,30 @@
         <w:t>można by</w:t>
       </w:r>
       <w:r>
-        <w:t xml:space="preserve"> powiedzieć, że państwo posiada duże </w:t>
-      </w:r>
-      <w:proofErr w:type="spellStart"/>
-      <w:r>
-        <w:t>power</w:t>
-      </w:r>
-      <w:proofErr w:type="spellEnd"/>
-      <w:r>
-        <w:t xml:space="preserve"> (</w:t>
-      </w:r>
-      <w:proofErr w:type="spellStart"/>
-      <w:r>
-        <w:t>Macht</w:t>
-      </w:r>
-      <w:proofErr w:type="spellEnd"/>
-      <w:r>
-        <w:t xml:space="preserve">). Natomiast kiedy zestawimy ze sobą dwa mocarstwa, oba zdolne zniszczyć się wzajemnie przy użyciu samej tylko broni atomowej, ich swoboda zostaje ograniczona. Można dyskutować, czy </w:t>
-      </w:r>
-      <w:proofErr w:type="spellStart"/>
-      <w:r>
-        <w:t>Macht</w:t>
-      </w:r>
-      <w:proofErr w:type="spellEnd"/>
-      <w:r>
-        <w:t xml:space="preserve"> nie jest wypadkową swobody działania państwa wobec wszystkich innych państw… równocześnie nie uważam takiej definicji za pomocne narzędzie z punktu widzenia badawczego. Filipiny nie ograniczające w żaden sposób sprawczości Maroka, nie mówią nam nic o rzeczywistej mocy sprawczej żadnego z tych państw.</w:t>
-      </w:r>
-      <w:r>
-        <w:t xml:space="preserve"> Ponadto, czasem ta sama zdolność </w:t>
-      </w:r>
-      <w:proofErr w:type="spellStart"/>
-      <w:r>
-        <w:t>zwiększajaca</w:t>
-      </w:r>
-      <w:proofErr w:type="spellEnd"/>
-      <w:r>
-        <w:t xml:space="preserve"> swobodę działania przeciwko jednemu państwu może nie mieć żadnego wpływu albo wręcz negatywny wpływ na </w:t>
-      </w:r>
-      <w:proofErr w:type="spellStart"/>
-      <w:r>
-        <w:t>Macht</w:t>
-      </w:r>
-      <w:proofErr w:type="spellEnd"/>
-      <w:r>
-        <w:t xml:space="preserve"> w kontekście innego zagrożenia. Włochy posiadają relatywnie potężną flotę, pozwalającą jej zarówno bronić swoich wybrzeży jak i dokonywać projekcji siły daleko poza swoje terytorium. Wśród narzędzi jakimi dysponuje włoska flota, można znaleźć śmigłowce zaprojektowane do wykrywania i zwalczania łodzi podwodnych. Jeżeli mielibyśmy porównywać zdolności militarnego oddziaływania Włoch na Austrię, kraj bez dostępu do morza, śmigłowce te nie tylko nie zwiększałyby Mach Włoch ale również skutkowałyby złym wykorzystaniem zasobów, środków które można by przeznaczyć na bardziej efektywny sposób oddziaływania na swojego sąsiada. </w:t>
+        <w:t xml:space="preserve"> powiedzieć, że państwo posiada duże power (Macht). Natomiast kiedy zestawimy ze sobą dwa mocarstwa, oba zdolne zniszczyć się wzajemnie przy użyciu samej tylko broni atomowej, ich swoboda zostaje ograniczona. Można dyskutować, czy Macht nie jest wypadkową swobody działania państwa wobec wszystkich innych państw… równocześnie nie uważam takiej definicji za pomocne narzędzie z punktu widzenia badawczego. Filipiny nie ograniczające w żaden sposób sprawczości Maroka, nie mówią nam nic o rzeczywistej mocy sprawczej żadnego z tych państw.</w:t>
+      </w:r>
+      <w:r>
+        <w:t xml:space="preserve"> Ponadto, czasem ta sama zdolność zwiększajaca swobodę działania przeciwko jednemu państwu może nie mieć żadnego wpływu albo wręcz negatywny wpływ na Macht w kontekście innego zagrożenia. Włochy posiadają relatywnie potężną flotę, pozwalającą jej zarówno bronić swoich wybrzeży jak i dokonywać projekcji siły daleko poza swoje terytorium. Wśród narzędzi jakimi dysponuje włoska flota, można znaleźć śmigłowce zaprojektowane do wykrywania i zwalczania łodzi podwodnych. Jeżeli mielibyśmy porównywać zdolności militarnego oddziaływania Włoch na Austrię, kraj bez dostępu do morza, śmigłowce te nie tylko nie zwiększałyby Mach Włoch ale również skutkowałyby złym wykorzystaniem zasobów, środków które można by przeznaczyć na bardziej efektywny sposób oddziaływania na swojego sąsiada. </w:t>
       </w:r>
       <w:r>
         <w:t xml:space="preserve">Mudżahedini, a później Talibowie, byli w stanie pokonać ZSRR, a potem USA, nie dlatego, że ich armie były silniejsze, a arsenał atomowy większy ale dlatego że były lepiej przystosowane do toczenia walki asymetrycznej. </w:t>
       </w:r>
       <w:r>
-        <w:t xml:space="preserve">Ten ostatni argument jest jednak bardziej obroną konceptu </w:t>
-      </w:r>
-      <w:proofErr w:type="spellStart"/>
-      <w:r>
-        <w:t>Macht</w:t>
-      </w:r>
-      <w:proofErr w:type="spellEnd"/>
-      <w:r>
-        <w:t xml:space="preserve"> niż jego krytyką, gdyż pokazuje, że </w:t>
-      </w:r>
-      <w:proofErr w:type="spellStart"/>
-      <w:r>
-        <w:t>Macht</w:t>
-      </w:r>
-      <w:proofErr w:type="spellEnd"/>
-      <w:r>
-        <w:t xml:space="preserve"> występuje jako relacja miedzy aktorami, a nie immanentna cecha analizowanego bytu.</w:t>
-      </w:r>
-    </w:p>
-    <w:p>
-      <w:pPr>
-        <w:jc w:val="both"/>
-      </w:pPr>
-      <w:r>
-        <w:t xml:space="preserve">Dodatkowo, </w:t>
-      </w:r>
-      <w:proofErr w:type="spellStart"/>
-      <w:r>
-        <w:t>Macht</w:t>
-      </w:r>
-      <w:proofErr w:type="spellEnd"/>
-      <w:r>
-        <w:t>, definiowana jako p</w:t>
-      </w:r>
-      <w:r>
-        <w:t xml:space="preserve">rawdopodobieństwo swobody działania może skutkować matematycznie możliwym zjawiskiem, kiedy państwo posiadające duży </w:t>
-      </w:r>
-      <w:proofErr w:type="spellStart"/>
-      <w:r>
-        <w:t>Macht</w:t>
-      </w:r>
-      <w:proofErr w:type="spellEnd"/>
-      <w:r>
-        <w:t xml:space="preserve"> (99% swobody działania) zostanie postawione w sytuacji w której nie może zachować się tak jak chce, a wyjątkowo słabe państwo (1% swobody działania) będzie raz po raz działać wbrew intencjom i przeszkodom innych aktorów.</w:t>
-      </w:r>
-      <w:r>
-        <w:t xml:space="preserve"> Równocześnie, jest to bardziej ciekawostka wynikająca z użycia terminu probabilistycznego, a nie sama krytyka konceptu, że </w:t>
-      </w:r>
-      <w:proofErr w:type="spellStart"/>
-      <w:r>
-        <w:t>Macht</w:t>
-      </w:r>
-      <w:proofErr w:type="spellEnd"/>
-      <w:r>
-        <w:t xml:space="preserve"> nie oznacza automatycznego sukcesu bądź porażki.</w:t>
+        <w:t>Ten ostatni argument jest jednak bardziej obroną konceptu Macht niż jego krytyką, gdyż pokazuje, że Macht występuje jako relacja miedzy aktorami, a nie immanentna cecha analizowanego bytu.</w:t>
+      </w:r>
+    </w:p>
+    <w:p>
+      <w:pPr>
+        <w:jc w:val="both"/>
+      </w:pPr>
+      <w:r>
+        <w:t>Dodatkowo, Macht, definiowana jako p</w:t>
+      </w:r>
+      <w:r>
+        <w:t>rawdopodobieństwo swobody działania może skutkować matematycznie możliwym zjawiskiem, kiedy państwo posiadające duży Macht (99% swobody działania) zostanie postawione w sytuacji w której nie może zachować się tak jak chce, a wyjątkowo słabe państwo (1% swobody działania) będzie raz po raz działać wbrew intencjom i przeszkodom innych aktorów.</w:t>
+      </w:r>
+      <w:r>
+        <w:t xml:space="preserve"> Równocześnie, jest to bardziej ciekawostka wynikająca z użycia terminu probabilistycznego, a nie sama krytyka konceptu, że Macht nie oznacza automatycznego sukcesu bądź porażki.</w:t>
       </w:r>
     </w:p>
     <w:p>
@@ -466,296 +250,34 @@
         <w:rPr>
           <w:color w:val="EE0000"/>
         </w:rPr>
-        <w:t>“</w:t>
-      </w:r>
-      <w:r>
+        <w:t>“in a position to carryout his own will despite resistance,” może być interpretowane jako zdolność do narzucenia woli innym, a nie jako Swoboda własnego działania.</w:t>
+      </w:r>
+    </w:p>
+    <w:p>
+      <w:pPr>
+        <w:jc w:val="both"/>
         <w:rPr>
           <w:color w:val="EE0000"/>
         </w:rPr>
-        <w:t xml:space="preserve">in a </w:t>
-      </w:r>
-      <w:proofErr w:type="spellStart"/>
-      <w:r>
-        <w:rPr>
-          <w:color w:val="EE0000"/>
-        </w:rPr>
-        <w:t>position</w:t>
-      </w:r>
-      <w:proofErr w:type="spellEnd"/>
-      <w:r>
-        <w:rPr>
-          <w:color w:val="EE0000"/>
-        </w:rPr>
-        <w:t xml:space="preserve"> to </w:t>
-      </w:r>
-      <w:proofErr w:type="spellStart"/>
-      <w:r>
-        <w:rPr>
-          <w:color w:val="EE0000"/>
-        </w:rPr>
-        <w:t>carryout</w:t>
-      </w:r>
-      <w:proofErr w:type="spellEnd"/>
-      <w:r>
-        <w:rPr>
-          <w:color w:val="EE0000"/>
-        </w:rPr>
-        <w:t xml:space="preserve"> </w:t>
-      </w:r>
-      <w:proofErr w:type="spellStart"/>
-      <w:r>
-        <w:rPr>
-          <w:color w:val="EE0000"/>
-        </w:rPr>
-        <w:t>his</w:t>
-      </w:r>
-      <w:proofErr w:type="spellEnd"/>
-      <w:r>
-        <w:rPr>
-          <w:color w:val="EE0000"/>
-        </w:rPr>
-        <w:t xml:space="preserve"> </w:t>
-      </w:r>
-      <w:proofErr w:type="spellStart"/>
-      <w:r>
-        <w:rPr>
-          <w:color w:val="EE0000"/>
-        </w:rPr>
-        <w:t>own</w:t>
-      </w:r>
-      <w:proofErr w:type="spellEnd"/>
-      <w:r>
-        <w:rPr>
-          <w:color w:val="EE0000"/>
-        </w:rPr>
-        <w:t xml:space="preserve"> </w:t>
-      </w:r>
-      <w:proofErr w:type="spellStart"/>
-      <w:r>
-        <w:rPr>
-          <w:color w:val="EE0000"/>
-        </w:rPr>
-        <w:t>will</w:t>
-      </w:r>
-      <w:proofErr w:type="spellEnd"/>
-      <w:r>
-        <w:rPr>
-          <w:color w:val="EE0000"/>
-        </w:rPr>
-        <w:t xml:space="preserve"> </w:t>
-      </w:r>
-      <w:proofErr w:type="spellStart"/>
-      <w:r>
-        <w:rPr>
-          <w:color w:val="EE0000"/>
-        </w:rPr>
-        <w:t>despite</w:t>
-      </w:r>
-      <w:proofErr w:type="spellEnd"/>
-      <w:r>
-        <w:rPr>
-          <w:color w:val="EE0000"/>
-        </w:rPr>
-        <w:t xml:space="preserve"> </w:t>
-      </w:r>
-      <w:proofErr w:type="spellStart"/>
-      <w:r>
-        <w:rPr>
-          <w:color w:val="EE0000"/>
-        </w:rPr>
-        <w:t>resistance</w:t>
-      </w:r>
-      <w:proofErr w:type="spellEnd"/>
-      <w:r>
-        <w:rPr>
-          <w:color w:val="EE0000"/>
-        </w:rPr>
-        <w:t>,</w:t>
-      </w:r>
-      <w:r>
-        <w:rPr>
-          <w:color w:val="EE0000"/>
-        </w:rPr>
-        <w:t>” może być interpretowane jako zdolność do narzucenia woli innym, a nie jako Swoboda własnego działania.</w:t>
-      </w:r>
-    </w:p>
-    <w:p>
-      <w:pPr>
-        <w:jc w:val="both"/>
-        <w:rPr>
-          <w:color w:val="EE0000"/>
-        </w:rPr>
-      </w:pPr>
-    </w:p>
-    <w:p>
-      <w:pPr>
-        <w:jc w:val="both"/>
-      </w:pPr>
-      <w:r>
-        <w:t xml:space="preserve">Spostrzeżenie: Webberowski </w:t>
-      </w:r>
-      <w:proofErr w:type="spellStart"/>
-      <w:r>
-        <w:t>Macht</w:t>
-      </w:r>
-      <w:proofErr w:type="spellEnd"/>
-      <w:r>
-        <w:t>, rozumiany jako swoboda działania, przypomina mi bardzo koncept ‘</w:t>
-      </w:r>
-      <w:proofErr w:type="spellStart"/>
-      <w:r>
-        <w:t>strategical</w:t>
-      </w:r>
-      <w:proofErr w:type="spellEnd"/>
-      <w:r>
-        <w:t xml:space="preserve"> </w:t>
-      </w:r>
-      <w:proofErr w:type="spellStart"/>
-      <w:r>
-        <w:t>autonomy</w:t>
-      </w:r>
-      <w:proofErr w:type="spellEnd"/>
-      <w:r>
-        <w:t xml:space="preserve">’ forsowany przez francuskich strategów. </w:t>
-      </w:r>
-    </w:p>
-    <w:p>
-      <w:pPr>
-        <w:jc w:val="both"/>
-      </w:pPr>
-      <w:r>
-        <w:t>“</w:t>
-      </w:r>
-      <w:proofErr w:type="spellStart"/>
-      <w:r>
-        <w:t>Domination</w:t>
-      </w:r>
-      <w:proofErr w:type="spellEnd"/>
-      <w:r>
-        <w:t xml:space="preserve">” (hard </w:t>
-      </w:r>
-      <w:proofErr w:type="spellStart"/>
-      <w:r>
-        <w:t>power</w:t>
-      </w:r>
-      <w:proofErr w:type="spellEnd"/>
-      <w:r>
-        <w:t>/</w:t>
-      </w:r>
-      <w:proofErr w:type="spellStart"/>
-      <w:r>
-        <w:t>coercion</w:t>
-      </w:r>
-      <w:proofErr w:type="spellEnd"/>
-      <w:r>
-        <w:t xml:space="preserve">?) </w:t>
-      </w:r>
-      <w:r>
-        <w:t>(</w:t>
-      </w:r>
-      <w:proofErr w:type="spellStart"/>
-      <w:r>
-        <w:t>Herrschat</w:t>
-      </w:r>
-      <w:proofErr w:type="spellEnd"/>
-      <w:r>
-        <w:t xml:space="preserve">) is the </w:t>
-      </w:r>
-      <w:proofErr w:type="spellStart"/>
-      <w:r>
-        <w:t>probability</w:t>
-      </w:r>
-      <w:proofErr w:type="spellEnd"/>
-      <w:r>
-        <w:t xml:space="preserve"> </w:t>
-      </w:r>
-      <w:proofErr w:type="spellStart"/>
-      <w:r>
-        <w:t>that</w:t>
-      </w:r>
-      <w:proofErr w:type="spellEnd"/>
-      <w:r>
-        <w:t xml:space="preserve"> a </w:t>
-      </w:r>
-      <w:proofErr w:type="spellStart"/>
-      <w:r>
-        <w:t>command</w:t>
-      </w:r>
-      <w:proofErr w:type="spellEnd"/>
-      <w:r>
-        <w:t xml:space="preserve"> with a </w:t>
-      </w:r>
-      <w:proofErr w:type="spellStart"/>
-      <w:r>
-        <w:t>given</w:t>
-      </w:r>
-      <w:proofErr w:type="spellEnd"/>
-      <w:r>
-        <w:t xml:space="preserve"> </w:t>
-      </w:r>
-      <w:proofErr w:type="spellStart"/>
-      <w:r>
-        <w:t>specific</w:t>
-      </w:r>
-      <w:proofErr w:type="spellEnd"/>
-      <w:r>
-        <w:t xml:space="preserve"> </w:t>
-      </w:r>
-      <w:proofErr w:type="spellStart"/>
-      <w:r>
-        <w:t>content</w:t>
-      </w:r>
-      <w:proofErr w:type="spellEnd"/>
-      <w:r>
-        <w:t xml:space="preserve"> </w:t>
-      </w:r>
-      <w:proofErr w:type="spellStart"/>
-      <w:r>
-        <w:t>will</w:t>
-      </w:r>
-      <w:proofErr w:type="spellEnd"/>
-      <w:r>
-        <w:t xml:space="preserve"> be </w:t>
-      </w:r>
-      <w:proofErr w:type="spellStart"/>
-      <w:r>
-        <w:t>obeyed</w:t>
-      </w:r>
-      <w:proofErr w:type="spellEnd"/>
-      <w:r>
-        <w:t xml:space="preserve"> by a </w:t>
-      </w:r>
-      <w:proofErr w:type="spellStart"/>
-      <w:r>
-        <w:t>given</w:t>
-      </w:r>
-      <w:proofErr w:type="spellEnd"/>
-      <w:r>
-        <w:t xml:space="preserve"> </w:t>
-      </w:r>
-      <w:proofErr w:type="spellStart"/>
-      <w:r>
-        <w:t>group</w:t>
-      </w:r>
-      <w:proofErr w:type="spellEnd"/>
-      <w:r>
-        <w:t xml:space="preserve"> of </w:t>
-      </w:r>
-      <w:proofErr w:type="spellStart"/>
-      <w:r>
-        <w:t>persons</w:t>
-      </w:r>
-      <w:proofErr w:type="spellEnd"/>
-      <w:r>
-        <w:t xml:space="preserve">. – Według tej definicji, dominacja czy też </w:t>
-      </w:r>
-      <w:proofErr w:type="spellStart"/>
-      <w:r>
-        <w:t>przmuszenie</w:t>
-      </w:r>
-      <w:proofErr w:type="spellEnd"/>
-      <w:r>
-        <w:t>, bazuje bardziej na strachu czy też obietnicy użycia jakiejś formy konsek</w:t>
+      </w:pPr>
+    </w:p>
+    <w:p>
+      <w:pPr>
+        <w:jc w:val="both"/>
+      </w:pPr>
+      <w:r>
+        <w:t xml:space="preserve">Spostrzeżenie: Webberowski Macht, rozumiany jako swoboda działania, przypomina mi bardzo koncept ‘strategical autonomy’ forsowany przez francuskich strategów. </w:t>
+      </w:r>
+    </w:p>
+    <w:p>
+      <w:pPr>
+        <w:jc w:val="both"/>
+      </w:pPr>
+      <w:r>
+        <w:t xml:space="preserve">“Domination” (hard power/coercion?) </w:t>
+      </w:r>
+      <w:r>
+        <w:t>(Herrschat) is the probability that a command with a given specific content will be obeyed by a given group of persons. – Według tej definicji, dominacja czy też przmuszenie, bazuje bardziej na strachu czy też obietnicy użycia jakiejś formy konsek</w:t>
       </w:r>
       <w:r>
         <w:t>wencji, bardziej niż na samym fizycznym zmuszeniu do wykonania akcji.</w:t>
@@ -774,41 +296,9 @@
         <w:jc w:val="both"/>
       </w:pPr>
       <w:r>
-        <w:t>Interpretacja konceptu ‘</w:t>
-      </w:r>
-      <w:proofErr w:type="spellStart"/>
-      <w:r>
-        <w:t>Macht</w:t>
-      </w:r>
-      <w:proofErr w:type="spellEnd"/>
-      <w:r>
-        <w:t xml:space="preserve">’ przez Isidor </w:t>
-      </w:r>
-      <w:proofErr w:type="spellStart"/>
-      <w:r>
-        <w:t>Wallimanna</w:t>
-      </w:r>
-      <w:proofErr w:type="spellEnd"/>
-      <w:r>
-        <w:t xml:space="preserve">, Howarda Rosenbauma, Nicholasa </w:t>
-      </w:r>
-      <w:proofErr w:type="spellStart"/>
-      <w:r>
-        <w:t>Tatsisa</w:t>
-      </w:r>
-      <w:proofErr w:type="spellEnd"/>
-      <w:r>
-        <w:t xml:space="preserve"> i George </w:t>
-      </w:r>
-      <w:proofErr w:type="spellStart"/>
-      <w:r>
-        <w:t>Zito</w:t>
-      </w:r>
-      <w:proofErr w:type="spellEnd"/>
-      <w:r>
-        <w:t xml:space="preserve">: </w:t>
-      </w:r>
-      <w:hyperlink r:id="rId8" w:history="1">
+        <w:t xml:space="preserve">Interpretacja konceptu ‘Macht’ przez Isidor Wallimanna, Howarda Rosenbauma, Nicholasa Tatsisa i George Zito: </w:t>
+      </w:r>
+      <w:hyperlink r:id="rId7" w:history="1">
         <w:r>
           <w:rPr>
             <w:rStyle w:val="Hipercze"/>
@@ -834,35 +324,7 @@
         <w:rPr>
           <w:lang w:val="en-US"/>
         </w:rPr>
-        <w:t xml:space="preserve">Np. Reinhard Bendix </w:t>
-      </w:r>
-      <w:proofErr w:type="spellStart"/>
-      <w:r>
-        <w:rPr>
-          <w:lang w:val="en-US"/>
-        </w:rPr>
-        <w:t>tłumaczy</w:t>
-      </w:r>
-      <w:proofErr w:type="spellEnd"/>
-      <w:r>
-        <w:rPr>
-          <w:lang w:val="en-US"/>
-        </w:rPr>
-        <w:t xml:space="preserve"> </w:t>
-      </w:r>
-      <w:proofErr w:type="spellStart"/>
-      <w:r>
-        <w:rPr>
-          <w:lang w:val="en-US"/>
-        </w:rPr>
-        <w:t>definicję</w:t>
-      </w:r>
-      <w:proofErr w:type="spellEnd"/>
-      <w:r>
-        <w:rPr>
-          <w:lang w:val="en-US"/>
-        </w:rPr>
-        <w:t xml:space="preserve"> </w:t>
+        <w:t xml:space="preserve">Np. Reinhard Bendix tłumaczy definicję </w:t>
       </w:r>
       <w:r>
         <w:rPr>
@@ -874,21 +336,7 @@
         <w:rPr>
           <w:lang w:val="en-US"/>
         </w:rPr>
-        <w:t xml:space="preserve">acht </w:t>
-      </w:r>
-      <w:proofErr w:type="spellStart"/>
-      <w:r>
-        <w:rPr>
-          <w:lang w:val="en-US"/>
-        </w:rPr>
-        <w:t>jako</w:t>
-      </w:r>
-      <w:proofErr w:type="spellEnd"/>
-      <w:r>
-        <w:rPr>
-          <w:lang w:val="en-US"/>
-        </w:rPr>
-        <w:t xml:space="preserve"> ‘</w:t>
+        <w:t>acht jako ‘</w:t>
       </w:r>
       <w:r>
         <w:rPr>
@@ -904,72 +352,17 @@
         </w:rPr>
         <w:t xml:space="preserve">’. </w:t>
       </w:r>
-      <w:proofErr w:type="spellStart"/>
-      <w:r>
-        <w:t>Widaż</w:t>
-      </w:r>
-      <w:proofErr w:type="spellEnd"/>
-      <w:r>
-        <w:t xml:space="preserve"> tutaj przeniesienie akcentu ze swobody działania jednostki na z</w:t>
+      <w:r>
+        <w:t>Widaż tutaj przeniesienie akcentu ze swobody działania jednostki na z</w:t>
       </w:r>
       <w:r>
         <w:t xml:space="preserve">dolność do wymuszania woli na innych co całkowicie odwraca moją poprzednią analizę. </w:t>
       </w:r>
-      <w:proofErr w:type="spellStart"/>
-      <w:r>
-        <w:rPr>
-          <w:lang w:val="en-US"/>
-        </w:rPr>
-        <w:t>Podobną</w:t>
-      </w:r>
-      <w:proofErr w:type="spellEnd"/>
-      <w:r>
-        <w:rPr>
-          <w:lang w:val="en-US"/>
-        </w:rPr>
-        <w:t xml:space="preserve"> </w:t>
-      </w:r>
-      <w:proofErr w:type="spellStart"/>
-      <w:r>
-        <w:rPr>
-          <w:lang w:val="en-US"/>
-        </w:rPr>
-        <w:t>analizę</w:t>
-      </w:r>
-      <w:proofErr w:type="spellEnd"/>
-      <w:r>
-        <w:rPr>
-          <w:lang w:val="en-US"/>
-        </w:rPr>
-        <w:t xml:space="preserve"> </w:t>
-      </w:r>
-      <w:proofErr w:type="spellStart"/>
-      <w:r>
-        <w:rPr>
-          <w:lang w:val="en-US"/>
-        </w:rPr>
-        <w:t>można</w:t>
-      </w:r>
-      <w:proofErr w:type="spellEnd"/>
-      <w:r>
-        <w:rPr>
-          <w:lang w:val="en-US"/>
-        </w:rPr>
-        <w:t xml:space="preserve"> </w:t>
-      </w:r>
-      <w:proofErr w:type="spellStart"/>
-      <w:r>
-        <w:rPr>
-          <w:lang w:val="en-US"/>
-        </w:rPr>
-        <w:t>znaleźć</w:t>
-      </w:r>
-      <w:proofErr w:type="spellEnd"/>
-      <w:r>
-        <w:rPr>
-          <w:lang w:val="en-US"/>
-        </w:rPr>
-        <w:t xml:space="preserve"> u Raymonda Arona ‘</w:t>
+      <w:r>
+        <w:rPr>
+          <w:lang w:val="en-US"/>
+        </w:rPr>
+        <w:t>Podobną analizę można znaleźć u Raymonda Arona ‘</w:t>
       </w:r>
       <w:r>
         <w:rPr>
@@ -1003,89 +396,11 @@
           <w:lang w:val="en-US"/>
         </w:rPr>
       </w:pPr>
-      <w:proofErr w:type="spellStart"/>
-      <w:r>
-        <w:rPr>
-          <w:lang w:val="en-US"/>
-        </w:rPr>
-        <w:t>Autorzy</w:t>
-      </w:r>
-      <w:proofErr w:type="spellEnd"/>
-      <w:r>
-        <w:rPr>
-          <w:lang w:val="en-US"/>
-        </w:rPr>
-        <w:t xml:space="preserve"> </w:t>
-      </w:r>
-      <w:proofErr w:type="spellStart"/>
-      <w:r>
-        <w:rPr>
-          <w:lang w:val="en-US"/>
-        </w:rPr>
-        <w:t>krytyki</w:t>
-      </w:r>
-      <w:proofErr w:type="spellEnd"/>
-      <w:r>
-        <w:rPr>
-          <w:lang w:val="en-US"/>
-        </w:rPr>
-        <w:t xml:space="preserve"> </w:t>
-      </w:r>
-      <w:proofErr w:type="spellStart"/>
-      <w:r>
-        <w:rPr>
-          <w:lang w:val="en-US"/>
-        </w:rPr>
-        <w:t>wykuli</w:t>
-      </w:r>
-      <w:proofErr w:type="spellEnd"/>
-      <w:r>
-        <w:rPr>
-          <w:lang w:val="en-US"/>
-        </w:rPr>
-        <w:t xml:space="preserve"> </w:t>
-      </w:r>
-      <w:proofErr w:type="spellStart"/>
-      <w:r>
-        <w:rPr>
-          <w:lang w:val="en-US"/>
-        </w:rPr>
-        <w:t>tłumaczenie</w:t>
-      </w:r>
-      <w:proofErr w:type="spellEnd"/>
-      <w:r>
-        <w:rPr>
-          <w:lang w:val="en-US"/>
-        </w:rPr>
-        <w:t xml:space="preserve"> </w:t>
-      </w:r>
-      <w:proofErr w:type="spellStart"/>
-      <w:r>
-        <w:rPr>
-          <w:lang w:val="en-US"/>
-        </w:rPr>
-        <w:t>które</w:t>
-      </w:r>
-      <w:proofErr w:type="spellEnd"/>
-      <w:r>
-        <w:rPr>
-          <w:lang w:val="en-US"/>
-        </w:rPr>
-        <w:t xml:space="preserve"> </w:t>
-      </w:r>
-      <w:proofErr w:type="spellStart"/>
-      <w:r>
-        <w:rPr>
-          <w:lang w:val="en-US"/>
-        </w:rPr>
-        <w:t>wygląda</w:t>
-      </w:r>
-      <w:proofErr w:type="spellEnd"/>
-      <w:r>
-        <w:rPr>
-          <w:lang w:val="en-US"/>
-        </w:rPr>
-        <w:t xml:space="preserve"> jak: ‘</w:t>
+      <w:r>
+        <w:rPr>
+          <w:lang w:val="en-US"/>
+        </w:rPr>
+        <w:t>Autorzy krytyki wykuli tłumaczenie które wygląda jak: ‘</w:t>
       </w:r>
       <w:r>
         <w:rPr>
@@ -1093,117 +408,46 @@
           <w:iCs/>
           <w:lang w:val="en-US"/>
         </w:rPr>
-        <w:t xml:space="preserve">Within a social relationship, power means every Chance (no matter </w:t>
-      </w:r>
-      <w:proofErr w:type="spellStart"/>
+        <w:t xml:space="preserve">Within a social relationship, power means every Chance (no matter whereon this chance is based) to carry through the own will (also against resistance). </w:t>
+      </w:r>
+    </w:p>
+    <w:p>
+      <w:pPr>
+        <w:jc w:val="both"/>
+      </w:pPr>
+      <w:r>
+        <w:t>Zanzaczyć tutaj trzeba, że b</w:t>
+      </w:r>
+      <w:r>
+        <w:t>ezpośrednim tłumaczeniem niemieckiego Macht, powinno być Might, nie Power. Power występujące w fizyce natomiast, tłumaczoneby było jako Kraft. Na domiar złego, Might wystepuje w angielskim jako określenie ekscesywnego zastosowania Power. Bez zastępowania oryginalnego Macht, moim ‘sprawczość’, tłumaczenie to mogłoby w języku polskim wyglądać tak:</w:t>
+      </w:r>
+    </w:p>
+    <w:p>
+      <w:pPr>
+        <w:jc w:val="both"/>
+      </w:pPr>
+      <w:r>
+        <w:t>‘</w:t>
+      </w:r>
       <w:r>
         <w:rPr>
           <w:i/>
           <w:iCs/>
-          <w:lang w:val="en-US"/>
-        </w:rPr>
-        <w:t>whereon</w:t>
-      </w:r>
-      <w:proofErr w:type="spellEnd"/>
+        </w:rPr>
+        <w:t>W ramach społecznych relacji, Power, oznacza jakąkolwiek szansę (pomijając jej źródła), na wykon</w:t>
+      </w:r>
       <w:r>
         <w:rPr>
           <w:i/>
           <w:iCs/>
-          <w:lang w:val="en-US"/>
-        </w:rPr>
-        <w:t xml:space="preserve"> this chance is based) to carry through the own will (also against resistance). </w:t>
-      </w:r>
-    </w:p>
-    <w:p>
-      <w:pPr>
-        <w:jc w:val="both"/>
-      </w:pPr>
-      <w:proofErr w:type="spellStart"/>
-      <w:r>
-        <w:t>Zanzaczyć</w:t>
-      </w:r>
-      <w:proofErr w:type="spellEnd"/>
-      <w:r>
-        <w:t xml:space="preserve"> tutaj trzeba, że b</w:t>
-      </w:r>
-      <w:r>
-        <w:t xml:space="preserve">ezpośrednim tłumaczeniem niemieckiego </w:t>
-      </w:r>
-      <w:proofErr w:type="spellStart"/>
-      <w:r>
-        <w:t>Macht</w:t>
-      </w:r>
-      <w:proofErr w:type="spellEnd"/>
-      <w:r>
-        <w:t xml:space="preserve">, powinno być </w:t>
-      </w:r>
-      <w:proofErr w:type="spellStart"/>
-      <w:r>
-        <w:t>Might</w:t>
-      </w:r>
-      <w:proofErr w:type="spellEnd"/>
-      <w:r>
-        <w:t xml:space="preserve">, nie Power. Power występujące w fizyce natomiast, </w:t>
-      </w:r>
-      <w:proofErr w:type="spellStart"/>
-      <w:r>
-        <w:t>tłumaczoneby</w:t>
-      </w:r>
-      <w:proofErr w:type="spellEnd"/>
-      <w:r>
-        <w:t xml:space="preserve"> było jako Kraft. Na domiar złego, </w:t>
-      </w:r>
-      <w:proofErr w:type="spellStart"/>
-      <w:r>
-        <w:t>Might</w:t>
-      </w:r>
-      <w:proofErr w:type="spellEnd"/>
-      <w:r>
-        <w:t xml:space="preserve"> </w:t>
-      </w:r>
-      <w:proofErr w:type="spellStart"/>
-      <w:r>
-        <w:t>wystepuje</w:t>
-      </w:r>
-      <w:proofErr w:type="spellEnd"/>
-      <w:r>
-        <w:t xml:space="preserve"> w angielskim jako określenie ekscesywnego zastosowania Power. Bez zastępowania oryginalnego </w:t>
-      </w:r>
-      <w:proofErr w:type="spellStart"/>
-      <w:r>
-        <w:t>Macht</w:t>
-      </w:r>
-      <w:proofErr w:type="spellEnd"/>
-      <w:r>
-        <w:t>, moim ‘sprawczość’, tłumaczenie to mogłoby w języku polskim wyglądać tak:</w:t>
-      </w:r>
-    </w:p>
-    <w:p>
-      <w:pPr>
-        <w:jc w:val="both"/>
-      </w:pPr>
-      <w:r>
-        <w:t>‘</w:t>
+        </w:rPr>
+        <w:t>ywanie</w:t>
       </w:r>
       <w:r>
         <w:rPr>
           <w:i/>
           <w:iCs/>
         </w:rPr>
-        <w:t>W ramach społecznych relacji, Power, oznacza jakąkolwiek szansę (pomijając jej źródła), na wykon</w:t>
-      </w:r>
-      <w:r>
-        <w:rPr>
-          <w:i/>
-          <w:iCs/>
-        </w:rPr>
-        <w:t>ywanie</w:t>
-      </w:r>
-      <w:r>
-        <w:rPr>
-          <w:i/>
-          <w:iCs/>
-        </w:rPr>
         <w:t xml:space="preserve"> swej woli (również przeciwko oporowi)’</w:t>
       </w:r>
     </w:p>
@@ -1212,198 +456,28 @@
         <w:jc w:val="both"/>
       </w:pPr>
       <w:r>
-        <w:t xml:space="preserve">Tak przetłumaczony </w:t>
-      </w:r>
-      <w:proofErr w:type="spellStart"/>
-      <w:r>
-        <w:t>Macht</w:t>
-      </w:r>
-      <w:proofErr w:type="spellEnd"/>
-      <w:r>
-        <w:t>, również skupia się na własnej swobodzie działania, a nie na wymuszaniu swej woli na innych.</w:t>
-      </w:r>
-    </w:p>
-    <w:p>
-      <w:pPr>
-        <w:jc w:val="both"/>
-        <w:rPr>
-          <w:lang w:val="en-US"/>
-        </w:rPr>
-      </w:pPr>
-      <w:proofErr w:type="spellStart"/>
-      <w:r>
-        <w:rPr>
-          <w:lang w:val="en-US"/>
-        </w:rPr>
-        <w:t>Alternatywnym</w:t>
-      </w:r>
-      <w:proofErr w:type="spellEnd"/>
-      <w:r>
-        <w:rPr>
-          <w:lang w:val="en-US"/>
-        </w:rPr>
-        <w:t xml:space="preserve"> </w:t>
-      </w:r>
-      <w:proofErr w:type="spellStart"/>
-      <w:r>
-        <w:rPr>
-          <w:lang w:val="en-US"/>
-        </w:rPr>
-        <w:t>znaczeniem</w:t>
-      </w:r>
-      <w:proofErr w:type="spellEnd"/>
-      <w:r>
-        <w:rPr>
-          <w:lang w:val="en-US"/>
-        </w:rPr>
-        <w:t xml:space="preserve">, </w:t>
-      </w:r>
-      <w:proofErr w:type="spellStart"/>
-      <w:r>
-        <w:rPr>
-          <w:lang w:val="en-US"/>
-        </w:rPr>
-        <w:t>zaprezentowanym</w:t>
-      </w:r>
-      <w:proofErr w:type="spellEnd"/>
-      <w:r>
-        <w:rPr>
-          <w:lang w:val="en-US"/>
-        </w:rPr>
-        <w:t xml:space="preserve"> </w:t>
-      </w:r>
-      <w:proofErr w:type="spellStart"/>
-      <w:r>
-        <w:rPr>
-          <w:lang w:val="en-US"/>
-        </w:rPr>
-        <w:t>przez</w:t>
-      </w:r>
-      <w:proofErr w:type="spellEnd"/>
-      <w:r>
-        <w:rPr>
-          <w:lang w:val="en-US"/>
-        </w:rPr>
-        <w:t xml:space="preserve"> </w:t>
-      </w:r>
-      <w:proofErr w:type="spellStart"/>
-      <w:r>
-        <w:rPr>
-          <w:lang w:val="en-US"/>
-        </w:rPr>
-        <w:t>autorów</w:t>
-      </w:r>
-      <w:proofErr w:type="spellEnd"/>
-      <w:r>
-        <w:rPr>
-          <w:lang w:val="en-US"/>
-        </w:rPr>
-        <w:t xml:space="preserve">, </w:t>
-      </w:r>
-      <w:proofErr w:type="spellStart"/>
-      <w:r>
-        <w:rPr>
-          <w:lang w:val="en-US"/>
-        </w:rPr>
-        <w:t>mające</w:t>
-      </w:r>
-      <w:proofErr w:type="spellEnd"/>
-      <w:r>
-        <w:rPr>
-          <w:lang w:val="en-US"/>
-        </w:rPr>
-        <w:t xml:space="preserve"> </w:t>
-      </w:r>
-      <w:proofErr w:type="spellStart"/>
-      <w:r>
-        <w:rPr>
-          <w:lang w:val="en-US"/>
-        </w:rPr>
-        <w:t>bliżej</w:t>
-      </w:r>
-      <w:proofErr w:type="spellEnd"/>
-      <w:r>
-        <w:rPr>
-          <w:lang w:val="en-US"/>
-        </w:rPr>
-        <w:t xml:space="preserve"> </w:t>
-      </w:r>
-      <w:proofErr w:type="spellStart"/>
-      <w:r>
-        <w:rPr>
-          <w:lang w:val="en-US"/>
-        </w:rPr>
-        <w:t>oddać</w:t>
-      </w:r>
-      <w:proofErr w:type="spellEnd"/>
-      <w:r>
-        <w:rPr>
-          <w:lang w:val="en-US"/>
-        </w:rPr>
-        <w:t xml:space="preserve"> </w:t>
-      </w:r>
-      <w:proofErr w:type="spellStart"/>
-      <w:r>
-        <w:rPr>
-          <w:lang w:val="en-US"/>
-        </w:rPr>
-        <w:t>esencję</w:t>
-      </w:r>
-      <w:proofErr w:type="spellEnd"/>
-      <w:r>
-        <w:rPr>
-          <w:lang w:val="en-US"/>
-        </w:rPr>
-        <w:t xml:space="preserve"> </w:t>
-      </w:r>
-      <w:proofErr w:type="spellStart"/>
-      <w:r>
-        <w:rPr>
-          <w:lang w:val="en-US"/>
-        </w:rPr>
-        <w:t>niemiekicej</w:t>
-      </w:r>
-      <w:proofErr w:type="spellEnd"/>
-      <w:r>
-        <w:rPr>
-          <w:lang w:val="en-US"/>
-        </w:rPr>
-        <w:t xml:space="preserve"> </w:t>
-      </w:r>
-      <w:proofErr w:type="spellStart"/>
-      <w:r>
-        <w:rPr>
-          <w:lang w:val="en-US"/>
-        </w:rPr>
-        <w:t>wersji</w:t>
-      </w:r>
-      <w:proofErr w:type="spellEnd"/>
-      <w:r>
-        <w:rPr>
-          <w:lang w:val="en-US"/>
-        </w:rPr>
-        <w:t xml:space="preserve">, jest: ‘Within a social relationship, power means any Chance </w:t>
+        <w:t>Tak przetłumaczony Macht, również skupia się na własnej swobodzie działania, a nie na wymuszaniu swej woli na innych.</w:t>
+      </w:r>
+    </w:p>
+    <w:p>
+      <w:pPr>
+        <w:jc w:val="both"/>
+        <w:rPr>
+          <w:lang w:val="en-US"/>
+        </w:rPr>
+      </w:pPr>
+      <w:r>
+        <w:rPr>
+          <w:lang w:val="en-US"/>
+        </w:rPr>
+        <w:t xml:space="preserve">Alternatywnym znaczeniem, zaprezentowanym przez autorów, mające bliżej oddać esencję niemiekicej wersji, jest: ‘Within a social relationship, power means any Chance </w:t>
       </w:r>
       <w:r>
         <w:rPr>
           <w:lang w:val="en-US"/>
         </w:rPr>
         <w:lastRenderedPageBreak/>
-        <w:t xml:space="preserve">(no matter </w:t>
-      </w:r>
-      <w:proofErr w:type="spellStart"/>
-      <w:r>
-        <w:rPr>
-          <w:lang w:val="en-US"/>
-        </w:rPr>
-        <w:t>whereon</w:t>
-      </w:r>
-      <w:proofErr w:type="spellEnd"/>
-      <w:r>
-        <w:rPr>
-          <w:lang w:val="en-US"/>
-        </w:rPr>
-        <w:t xml:space="preserve"> this chance is based) to carry through one’s own wil</w:t>
+        <w:t>(no matter whereon this chance is based) to carry through one’s own wil</w:t>
       </w:r>
       <w:r>
         <w:rPr>
@@ -1428,86 +502,26 @@
         <w:t>Autorzy zwracają również uwagę n</w:t>
       </w:r>
       <w:r>
-        <w:t xml:space="preserve">a stronę aktywną czasownika ‘to </w:t>
-      </w:r>
-      <w:proofErr w:type="spellStart"/>
-      <w:r>
-        <w:t>carry</w:t>
-      </w:r>
-      <w:proofErr w:type="spellEnd"/>
-      <w:r>
-        <w:t xml:space="preserve"> </w:t>
-      </w:r>
-      <w:proofErr w:type="spellStart"/>
-      <w:r>
-        <w:t>through</w:t>
-      </w:r>
-      <w:proofErr w:type="spellEnd"/>
-      <w:r>
-        <w:t xml:space="preserve">’. Power nie będzie ‘in a </w:t>
-      </w:r>
-      <w:proofErr w:type="spellStart"/>
-      <w:r>
-        <w:t>position</w:t>
-      </w:r>
-      <w:proofErr w:type="spellEnd"/>
-      <w:r>
-        <w:t xml:space="preserve"> to </w:t>
-      </w:r>
-      <w:proofErr w:type="spellStart"/>
-      <w:r>
-        <w:t>carry</w:t>
-      </w:r>
-      <w:proofErr w:type="spellEnd"/>
-      <w:r>
-        <w:t>’, nie jest pasywną cechą czegoś lub kogoś, a jest zdolnością która trwa, jest aktywnie wykonywana (i nie musi mieć końca sama w sobie).</w:t>
-      </w:r>
-    </w:p>
-    <w:p>
-      <w:pPr>
-        <w:jc w:val="both"/>
-      </w:pPr>
-    </w:p>
-    <w:p>
-      <w:pPr>
-        <w:jc w:val="both"/>
-        <w:rPr>
-          <w:lang w:val="en-US"/>
-        </w:rPr>
-      </w:pPr>
-      <w:r>
-        <w:rPr>
-          <w:lang w:val="en-US"/>
-        </w:rPr>
-        <w:t xml:space="preserve">Mennell’s </w:t>
-      </w:r>
-      <w:proofErr w:type="spellStart"/>
-      <w:r>
-        <w:rPr>
-          <w:lang w:val="en-US"/>
-        </w:rPr>
-        <w:t>komentarz</w:t>
-      </w:r>
-      <w:proofErr w:type="spellEnd"/>
-      <w:r>
-        <w:rPr>
-          <w:lang w:val="en-US"/>
-        </w:rPr>
-        <w:t xml:space="preserve"> </w:t>
-      </w:r>
-      <w:proofErr w:type="spellStart"/>
-      <w:r>
-        <w:rPr>
-          <w:lang w:val="en-US"/>
-        </w:rPr>
-        <w:t>dotyczący</w:t>
-      </w:r>
-      <w:proofErr w:type="spellEnd"/>
-      <w:r>
-        <w:rPr>
-          <w:lang w:val="en-US"/>
-        </w:rPr>
-        <w:t xml:space="preserve"> power: ‘Power cannot be</w:t>
+        <w:t>a stronę aktywną czasownika ‘to carry through’. Power nie będzie ‘in a position to carry’, nie jest pasywną cechą czegoś lub kogoś, a jest zdolnością która trwa, jest aktywnie wykonywana (i nie musi mieć końca sama w sobie).</w:t>
+      </w:r>
+    </w:p>
+    <w:p>
+      <w:pPr>
+        <w:jc w:val="both"/>
+      </w:pPr>
+    </w:p>
+    <w:p>
+      <w:pPr>
+        <w:jc w:val="both"/>
+        <w:rPr>
+          <w:lang w:val="en-US"/>
+        </w:rPr>
+      </w:pPr>
+      <w:r>
+        <w:rPr>
+          <w:lang w:val="en-US"/>
+        </w:rPr>
+        <w:t>Mennell’s komentarz dotyczący power: ‘Power cannot be</w:t>
       </w:r>
       <w:r>
         <w:rPr>
@@ -1573,10 +587,154 @@
         <w:jc w:val="both"/>
       </w:pPr>
       <w:r>
-        <w:t>Proces, sprawczość, oddziaływanie. Co robię?</w:t>
+        <w:rPr>
+          <w:lang w:val="en-US"/>
+        </w:rPr>
+        <w:t xml:space="preserve">Proces, sprawczość, oddziaływanie. </w:t>
+      </w:r>
+      <w:r>
+        <w:t>Co robię?</w:t>
       </w:r>
       <w:r>
         <w:t xml:space="preserve"> Wpływam na innych. </w:t>
+      </w:r>
+    </w:p>
+    <w:p>
+      <w:pPr>
+        <w:jc w:val="both"/>
+      </w:pPr>
+    </w:p>
+    <w:p>
+      <w:pPr>
+        <w:jc w:val="both"/>
+        <w:rPr>
+          <w:lang w:val="en-US"/>
+        </w:rPr>
+      </w:pPr>
+      <w:r>
+        <w:rPr>
+          <w:lang w:val="en-US"/>
+        </w:rPr>
+        <w:t>Webester’s seventh new collegiate dictionary d</w:t>
+      </w:r>
+      <w:r>
+        <w:rPr>
+          <w:lang w:val="en-US"/>
+        </w:rPr>
+        <w:t>efiniuje power (na 666stronie :D)</w:t>
+      </w:r>
+    </w:p>
+    <w:p>
+      <w:pPr>
+        <w:jc w:val="both"/>
+      </w:pPr>
+      <w:r>
+        <w:rPr>
+          <w:lang w:val="en-US"/>
+        </w:rPr>
+        <w:t xml:space="preserve">Power jako ‘to be able to… posses a control, authority or influence over others.’ </w:t>
+      </w:r>
+      <w:r>
+        <w:t xml:space="preserve">Jednoczesnie rozróżnia on między power, a potent (to be powerful) Zatem </w:t>
+      </w:r>
+      <w:r>
+        <w:t>jeśli posaidasz duży potential, możesz oddziaływać na innych (to be able to act).</w:t>
+      </w:r>
+    </w:p>
+    <w:p>
+      <w:pPr>
+        <w:jc w:val="both"/>
+      </w:pPr>
+    </w:p>
+    <w:p>
+      <w:pPr>
+        <w:jc w:val="both"/>
+      </w:pPr>
+      <w:r>
+        <w:t>Równocześnie, w definicji pojawia się słowo authority.</w:t>
+      </w:r>
+    </w:p>
+    <w:p>
+      <w:pPr>
+        <w:jc w:val="both"/>
+      </w:pPr>
+    </w:p>
+    <w:p>
+      <w:pPr>
+        <w:jc w:val="both"/>
+      </w:pPr>
+    </w:p>
+    <w:p>
+      <w:pPr>
+        <w:jc w:val="both"/>
+        <w:rPr>
+          <w:lang w:val="en-US"/>
+        </w:rPr>
+      </w:pPr>
+      <w:r>
+        <w:rPr>
+          <w:lang w:val="en-US"/>
+        </w:rPr>
+        <w:t>Inne confundujące definicje: Agent – one who act</w:t>
+      </w:r>
+      <w:r>
+        <w:rPr>
+          <w:lang w:val="en-US"/>
+        </w:rPr>
+        <w:t>s for or in the place of another by authority from him… ale również… a person responsible for his acts.</w:t>
+      </w:r>
+    </w:p>
+    <w:p>
+      <w:pPr>
+        <w:jc w:val="both"/>
+        <w:rPr>
+          <w:lang w:val="en-US"/>
+        </w:rPr>
+      </w:pPr>
+    </w:p>
+    <w:p>
+      <w:pPr>
+        <w:jc w:val="both"/>
+      </w:pPr>
+      <w:r>
+        <w:t>Czy państwa same w sobie s</w:t>
+      </w:r>
+      <w:r>
+        <w:t>ą anarchistyczne? Skoro scena stosunków międzynarodowych jest anarchistyczna (jeżeli jest) oraz jeżeli państwa dążą do maksymalizacji swobody działania i wpływu na inne, to czy nie chcą pozbyć się jakiegokolwiek autorytetu, które by ograniczały ich własną sprawczość? Nie, ponieważ anarchista buntuje się przeciwko każdemu objawowi autorytetu… również przeciwko swojemu własnemu.</w:t>
+      </w:r>
+    </w:p>
+    <w:p>
+      <w:pPr>
+        <w:jc w:val="both"/>
+      </w:pPr>
+      <w:r>
+        <w:lastRenderedPageBreak/>
+        <w:t>Dodatkowo, cechą niezbędna do zaistnienia anarchii jest akt buntu. Jeżeli wszyscy zgadzają się na status quo, nie ma anrachi. Jeżeli nikt nie psioaida jakiegokolwiek autorytetu, również nie ma anarchii.</w:t>
+      </w:r>
+    </w:p>
+    <w:p>
+      <w:pPr>
+        <w:jc w:val="both"/>
+      </w:pPr>
+    </w:p>
+    <w:p>
+      <w:pPr>
+        <w:jc w:val="both"/>
+        <w:rPr>
+          <w:lang w:val="en-US"/>
+        </w:rPr>
+      </w:pPr>
+      <w:r>
+        <w:rPr>
+          <w:lang w:val="en-US"/>
+        </w:rPr>
+        <w:t>Authority – opinion, decision, power, a c</w:t>
+      </w:r>
+      <w:r>
+        <w:rPr>
+          <w:lang w:val="en-US"/>
+        </w:rPr>
+        <w:t>itation used in defense or support, the source from which the citiation is drawn, a conclusive statement or set of semantics, decision taken as a precedent</w:t>
       </w:r>
     </w:p>
     <w:sectPr>
@@ -1680,21 +838,7 @@
         <w:rPr>
           <w:lang w:val="en-US"/>
         </w:rPr>
-        <w:t xml:space="preserve">3, </w:t>
-      </w:r>
-      <w:proofErr w:type="spellStart"/>
-      <w:r>
-        <w:rPr>
-          <w:lang w:val="en-US"/>
-        </w:rPr>
-        <w:t>źródło</w:t>
-      </w:r>
-      <w:proofErr w:type="spellEnd"/>
-      <w:r>
-        <w:rPr>
-          <w:lang w:val="en-US"/>
-        </w:rPr>
-        <w:t xml:space="preserve">: </w:t>
+        <w:t xml:space="preserve">3, źródło: </w:t>
       </w:r>
       <w:hyperlink r:id="rId1" w:history="1">
         <w:r>
@@ -1714,10 +858,6 @@
     </w:p>
   </w:footnote>
 </w:footnotes>
-</file>
-
-<file path=word/numbering.xml><?xml version="1.0" encoding="utf-8"?>
-<w:numbering xmlns:wpc="http://schemas.microsoft.com/office/word/2010/wordprocessingCanvas" xmlns:cx="http://schemas.microsoft.com/office/drawing/2014/chartex" xmlns:cx1="http://schemas.microsoft.com/office/drawing/2015/9/8/chartex" xmlns:cx2="http://schemas.microsoft.com/office/drawing/2015/10/21/chartex" xmlns:cx3="http://schemas.microsoft.com/office/drawing/2016/5/9/chartex" xmlns:cx4="http://schemas.microsoft.com/office/drawing/2016/5/10/chartex" xmlns:cx5="http://schemas.microsoft.com/office/drawing/2016/5/11/chartex" xmlns:cx6="http://schemas.microsoft.com/office/drawing/2016/5/12/chartex" xmlns:cx7="http://schemas.microsoft.com/office/drawing/2016/5/13/chartex" xmlns:cx8="http://schemas.microsoft.com/office/drawing/2016/5/14/chartex" xmlns:mc="http://schemas.openxmlformats.org/markup-compatibility/2006" xmlns:aink="http://schemas.microsoft.com/office/drawing/2016/ink" xmlns:am3d="http://schemas.microsoft.com/office/drawing/2017/model3d" xmlns:o="urn:schemas-microsoft-com:office:office" xmlns:oel="http://schemas.microsoft.com/office/2019/extlst" xmlns:r="http://schemas.openxmlformats.org/officeDocument/2006/relationships" xmlns:m="http://schemas.openxmlformats.org/officeDocument/2006/math" xmlns:v="urn:schemas-microsoft-com:vml" xmlns:wp14="http://schemas.microsoft.com/office/word/2010/wordprocessingDrawing" xmlns:wp="http://schemas.openxmlformats.org/drawingml/2006/wordprocessingDrawing" xmlns:w10="urn:schemas-microsoft-com:office:word" xmlns:w="http://schemas.openxmlformats.org/wordprocessingml/2006/main" xmlns:w14="http://schemas.microsoft.com/office/word/2010/wordml" xmlns:w15="http://schemas.microsoft.com/office/word/2012/wordml" xmlns:w16cex="http://schemas.microsoft.com/office/word/2018/wordml/cex" xmlns:w16cid="http://schemas.microsoft.com/office/word/2016/wordml/cid" xmlns:w16="http://schemas.microsoft.com/office/word/2018/wordml" xmlns:w16du="http://schemas.microsoft.com/office/word/2023/wordml/word16du" xmlns:w16sdtdh="http://schemas.microsoft.com/office/word/2020/wordml/sdtdatahash" xmlns:w16sdtfl="http://schemas.microsoft.com/office/word/2024/wordml/sdtformatlock" xmlns:w16se="http://schemas.microsoft.com/office/word/2015/wordml/symex" xmlns:wpg="http://schemas.microsoft.com/office/word/2010/wordprocessingGroup" xmlns:wpi="http://schemas.microsoft.com/office/word/2010/wordprocessingInk" xmlns:wne="http://schemas.microsoft.com/office/word/2006/wordml" xmlns:wps="http://schemas.microsoft.com/office/word/2010/wordprocessingShape" mc:Ignorable="w14 w15 w16se w16cid w16 w16cex w16sdtdh w16sdtfl w16du wp14"/>
 </file>
 
 <file path=word/styles.xml><?xml version="1.0" encoding="utf-8"?>

</xml_diff>